<commit_message>
revivse the report of five portions of fresh produce
</commit_message>
<xml_diff>
--- a/IELTS Notes/Vocabulary of IELTS Test/Vocabulary of IELTS Liz.docx
+++ b/IELTS Notes/Vocabulary of IELTS Test/Vocabulary of IELTS Liz.docx
@@ -6,7 +6,7 @@
       <w:pPr>
         <w:outlineLvl w:val="0"/>
         <w:rPr>
-          <w:rFonts w:ascii="Times New Roman" w:hAnsi="Times New Roman" w:cs="Times New Roman" w:hint="eastAsia"/>
+          <w:rFonts w:ascii="Times New Roman" w:hAnsi="Times New Roman" w:cs="Times New Roman"/>
           <w:b/>
           <w:sz w:val="32"/>
         </w:rPr>
@@ -25,7 +25,7 @@
         <w:outlineLvl w:val="1"/>
         <w:rPr>
           <w:rStyle w:val="pron"/>
-          <w:rFonts w:ascii="Times New Roman" w:hAnsi="Times New Roman" w:cs="Times New Roman" w:hint="eastAsia"/>
+          <w:rFonts w:ascii="Times New Roman" w:hAnsi="Times New Roman" w:cs="Times New Roman"/>
           <w:b/>
           <w:sz w:val="24"/>
         </w:rPr>
@@ -376,7 +376,7 @@
       <w:pPr>
         <w:rPr>
           <w:rStyle w:val="pron"/>
-          <w:rFonts w:ascii="Arial" w:hAnsi="Arial" w:cs="Arial" w:hint="eastAsia"/>
+          <w:rFonts w:ascii="Arial" w:hAnsi="Arial" w:cs="Arial"/>
         </w:rPr>
       </w:pPr>
       <w:r>
@@ -420,7 +420,7 @@
       <w:pPr>
         <w:rPr>
           <w:rStyle w:val="pron"/>
-          <w:rFonts w:ascii="Arial" w:hAnsi="Arial" w:cs="Arial" w:hint="eastAsia"/>
+          <w:rFonts w:ascii="Arial" w:hAnsi="Arial" w:cs="Arial"/>
         </w:rPr>
       </w:pPr>
       <w:r>
@@ -560,7 +560,7 @@
       <w:pPr>
         <w:rPr>
           <w:rStyle w:val="pron"/>
-          <w:rFonts w:ascii="Arial" w:hAnsi="Arial" w:cs="Arial" w:hint="eastAsia"/>
+          <w:rFonts w:ascii="Arial" w:hAnsi="Arial" w:cs="Arial"/>
         </w:rPr>
       </w:pPr>
       <w:r>
@@ -698,7 +698,7 @@
       <w:pPr>
         <w:rPr>
           <w:rStyle w:val="pron"/>
-          <w:rFonts w:ascii="Arial" w:hAnsi="Arial" w:cs="Arial" w:hint="eastAsia"/>
+          <w:rFonts w:ascii="Arial" w:hAnsi="Arial" w:cs="Arial"/>
         </w:rPr>
       </w:pPr>
       <w:r>
@@ -729,7 +729,7 @@
       <w:pPr>
         <w:rPr>
           <w:rStyle w:val="pron"/>
-          <w:rFonts w:ascii="Arial" w:hAnsi="Arial" w:cs="Arial" w:hint="eastAsia"/>
+          <w:rFonts w:ascii="Arial" w:hAnsi="Arial" w:cs="Arial"/>
         </w:rPr>
       </w:pPr>
       <w:r>
@@ -808,7 +808,7 @@
       <w:pPr>
         <w:rPr>
           <w:rStyle w:val="pron"/>
-          <w:rFonts w:ascii="Times New Roman" w:hAnsi="Times New Roman" w:cs="Times New Roman" w:hint="eastAsia"/>
+          <w:rFonts w:ascii="Times New Roman" w:hAnsi="Times New Roman" w:cs="Times New Roman"/>
         </w:rPr>
       </w:pPr>
       <w:r>
@@ -1020,7 +1020,7 @@
       <w:pPr>
         <w:rPr>
           <w:rStyle w:val="pron"/>
-          <w:rFonts w:ascii="Times New Roman" w:hAnsi="Times New Roman" w:cs="Times New Roman" w:hint="eastAsia"/>
+          <w:rFonts w:ascii="Times New Roman" w:hAnsi="Times New Roman" w:cs="Times New Roman"/>
         </w:rPr>
       </w:pPr>
       <w:r>
@@ -1164,7 +1164,7 @@
         <w:outlineLvl w:val="2"/>
         <w:rPr>
           <w:rStyle w:val="pron"/>
-          <w:rFonts w:ascii="Times New Roman" w:hAnsi="Times New Roman" w:cs="Times New Roman" w:hint="eastAsia"/>
+          <w:rFonts w:ascii="Times New Roman" w:hAnsi="Times New Roman" w:cs="Times New Roman"/>
           <w:b/>
           <w:sz w:val="24"/>
         </w:rPr>
@@ -1183,7 +1183,7 @@
       <w:pPr>
         <w:rPr>
           <w:rStyle w:val="pron"/>
-          <w:rFonts w:ascii="Times New Roman" w:hAnsi="Times New Roman" w:cs="Times New Roman" w:hint="eastAsia"/>
+          <w:rFonts w:ascii="Times New Roman" w:hAnsi="Times New Roman" w:cs="Times New Roman"/>
         </w:rPr>
       </w:pPr>
       <w:r>
@@ -1213,7 +1213,7 @@
       <w:pPr>
         <w:rPr>
           <w:rStyle w:val="pron"/>
-          <w:rFonts w:ascii="Times New Roman" w:hAnsi="Times New Roman" w:cs="Times New Roman" w:hint="eastAsia"/>
+          <w:rFonts w:ascii="Times New Roman" w:hAnsi="Times New Roman" w:cs="Times New Roman"/>
         </w:rPr>
       </w:pPr>
       <w:r>
@@ -1279,7 +1279,7 @@
       <w:pPr>
         <w:rPr>
           <w:rStyle w:val="pron"/>
-          <w:rFonts w:ascii="Times New Roman" w:hAnsi="Times New Roman" w:cs="Times New Roman" w:hint="eastAsia"/>
+          <w:rFonts w:ascii="Times New Roman" w:hAnsi="Times New Roman" w:cs="Times New Roman"/>
         </w:rPr>
       </w:pPr>
       <w:r>
@@ -1363,7 +1363,7 @@
       <w:pPr>
         <w:rPr>
           <w:rStyle w:val="pron"/>
-          <w:rFonts w:ascii="Times New Roman" w:hAnsi="Times New Roman" w:cs="Times New Roman" w:hint="eastAsia"/>
+          <w:rFonts w:ascii="Times New Roman" w:hAnsi="Times New Roman" w:cs="Times New Roman"/>
         </w:rPr>
       </w:pPr>
       <w:r>
@@ -1456,7 +1456,7 @@
       <w:pPr>
         <w:rPr>
           <w:rStyle w:val="pron"/>
-          <w:rFonts w:ascii="Times New Roman" w:hAnsi="Times New Roman" w:cs="Times New Roman" w:hint="eastAsia"/>
+          <w:rFonts w:ascii="Times New Roman" w:hAnsi="Times New Roman" w:cs="Times New Roman"/>
         </w:rPr>
       </w:pPr>
       <w:r>
@@ -1528,7 +1528,7 @@
       <w:pPr>
         <w:rPr>
           <w:rStyle w:val="pron"/>
-          <w:rFonts w:ascii="Times New Roman" w:hAnsi="Times New Roman" w:cs="Times New Roman" w:hint="eastAsia"/>
+          <w:rFonts w:ascii="Times New Roman" w:hAnsi="Times New Roman" w:cs="Times New Roman"/>
         </w:rPr>
       </w:pPr>
       <w:r>
@@ -1558,7 +1558,7 @@
       <w:pPr>
         <w:rPr>
           <w:rStyle w:val="pron"/>
-          <w:rFonts w:ascii="Times New Roman" w:hAnsi="Times New Roman" w:cs="Times New Roman" w:hint="eastAsia"/>
+          <w:rFonts w:ascii="Times New Roman" w:hAnsi="Times New Roman" w:cs="Times New Roman"/>
         </w:rPr>
       </w:pPr>
       <w:r>
@@ -1602,7 +1602,7 @@
       <w:pPr>
         <w:rPr>
           <w:rStyle w:val="pron"/>
-          <w:rFonts w:ascii="Times New Roman" w:hAnsi="Times New Roman" w:cs="Times New Roman" w:hint="eastAsia"/>
+          <w:rFonts w:ascii="Times New Roman" w:hAnsi="Times New Roman" w:cs="Times New Roman"/>
         </w:rPr>
       </w:pPr>
       <w:r>
@@ -1646,7 +1646,7 @@
       <w:pPr>
         <w:rPr>
           <w:rStyle w:val="pron"/>
-          <w:rFonts w:ascii="Times New Roman" w:hAnsi="Times New Roman" w:cs="Times New Roman" w:hint="eastAsia"/>
+          <w:rFonts w:ascii="Times New Roman" w:hAnsi="Times New Roman" w:cs="Times New Roman"/>
         </w:rPr>
       </w:pPr>
       <w:r>
@@ -1684,67 +1684,251 @@
           <w:rFonts w:ascii="Times New Roman" w:hAnsi="Times New Roman" w:cs="Times New Roman" w:hint="eastAsia"/>
         </w:rPr>
         <w:t>loading chute</w:t>
+      </w:r>
+    </w:p>
+    <w:p>
+      <w:pPr>
+        <w:rPr>
+          <w:rStyle w:val="pron"/>
+          <w:rFonts w:ascii="Times New Roman" w:hAnsi="Times New Roman" w:cs="Times New Roman" w:hint="eastAsia"/>
+        </w:rPr>
+      </w:pPr>
+      <w:r>
+        <w:rPr>
+          <w:rStyle w:val="pron"/>
+          <w:rFonts w:ascii="Times New Roman" w:hAnsi="Times New Roman" w:cs="Times New Roman" w:hint="eastAsia"/>
+          <w:b/>
+        </w:rPr>
+        <w:t>deadstock</w:t>
+      </w:r>
+      <w:r>
+        <w:rPr>
+          <w:rStyle w:val="pron"/>
+          <w:rFonts w:ascii="Times New Roman" w:hAnsi="Times New Roman" w:cs="Times New Roman"/>
+        </w:rPr>
+        <w:br/>
+      </w:r>
+      <w:r>
+        <w:rPr>
+          <w:rStyle w:val="pron"/>
+          <w:rFonts w:ascii="Times New Roman" w:hAnsi="Times New Roman" w:cs="Times New Roman" w:hint="eastAsia"/>
+        </w:rPr>
+        <w:t>[n.] the machine us</w:t>
+      </w:r>
+      <w:r>
+        <w:rPr>
+          <w:rStyle w:val="pron"/>
+          <w:rFonts w:ascii="Times New Roman" w:hAnsi="Times New Roman" w:cs="Times New Roman" w:hint="eastAsia"/>
+        </w:rPr>
+        <w:t>ed on a farm as opposed to the live</w:t>
+      </w:r>
+      <w:r>
+        <w:rPr>
+          <w:rStyle w:val="pron"/>
+          <w:rFonts w:ascii="Times New Roman" w:hAnsi="Times New Roman" w:cs="Times New Roman" w:hint="eastAsia"/>
+        </w:rPr>
+        <w:t>stock</w:t>
+      </w:r>
+      <w:r>
+        <w:rPr>
+          <w:rStyle w:val="pron"/>
+          <w:rFonts w:ascii="Times New Roman" w:hAnsi="Times New Roman" w:cs="Times New Roman" w:hint="eastAsia"/>
+        </w:rPr>
+        <w:t>.</w:t>
+      </w:r>
+    </w:p>
+    <w:p>
+      <w:pPr>
+        <w:rPr>
+          <w:rStyle w:val="pron"/>
+          <w:rFonts w:ascii="Times New Roman" w:hAnsi="Times New Roman" w:cs="Times New Roman" w:hint="eastAsia"/>
+        </w:rPr>
+      </w:pPr>
+    </w:p>
+    <w:p>
+      <w:pPr>
+        <w:rPr>
+          <w:rStyle w:val="pron"/>
+          <w:rFonts w:ascii="Times New Roman" w:hAnsi="Times New Roman" w:cs="Times New Roman"/>
+        </w:rPr>
+      </w:pPr>
+    </w:p>
+    <w:p>
+      <w:pPr>
+        <w:rPr>
+          <w:rFonts w:ascii="Times New Roman" w:hAnsi="Times New Roman" w:cs="Times New Roman" w:hint="eastAsia"/>
+        </w:rPr>
+      </w:pPr>
+    </w:p>
+    <w:p>
+      <w:pPr>
+        <w:outlineLvl w:val="0"/>
+        <w:rPr>
+          <w:rFonts w:ascii="Times New Roman" w:hAnsi="Times New Roman" w:cs="Times New Roman"/>
+          <w:b/>
+          <w:sz w:val="32"/>
+        </w:rPr>
+      </w:pPr>
+      <w:r>
+        <w:rPr>
+          <w:rFonts w:ascii="Times New Roman" w:hAnsi="Times New Roman" w:cs="Times New Roman" w:hint="eastAsia"/>
+          <w:b/>
+          <w:sz w:val="32"/>
+        </w:rPr>
+        <w:lastRenderedPageBreak/>
+        <w:t>Writing</w:t>
+      </w:r>
+    </w:p>
+    <w:p>
+      <w:pPr>
+        <w:outlineLvl w:val="2"/>
+        <w:rPr>
+          <w:rStyle w:val="pron"/>
+          <w:rFonts w:ascii="Times New Roman" w:hAnsi="Times New Roman" w:cs="Times New Roman"/>
+          <w:b/>
+          <w:sz w:val="24"/>
+        </w:rPr>
+      </w:pPr>
+      <w:r>
+        <w:rPr>
+          <w:rStyle w:val="pron"/>
+          <w:rFonts w:ascii="Times New Roman" w:hAnsi="Times New Roman" w:cs="Times New Roman" w:hint="eastAsia"/>
+          <w:b/>
+          <w:sz w:val="24"/>
+        </w:rPr>
+        <w:t xml:space="preserve">1. </w:t>
+      </w:r>
+      <w:r>
+        <w:rPr>
+          <w:rStyle w:val="pron"/>
+          <w:rFonts w:ascii="Times New Roman" w:hAnsi="Times New Roman" w:cs="Times New Roman" w:hint="eastAsia"/>
+          <w:b/>
+          <w:sz w:val="24"/>
+        </w:rPr>
+        <w:t>Five portions of fruit and vegetables</w:t>
+      </w:r>
+    </w:p>
+    <w:p>
+      <w:pPr>
+        <w:rPr>
+          <w:rFonts w:ascii="Times New Roman" w:hAnsi="Times New Roman" w:cs="Times New Roman"/>
+        </w:rPr>
+      </w:pPr>
+      <w:r>
+        <w:rPr>
+          <w:rStyle w:val="pron"/>
+          <w:rFonts w:ascii="Arial" w:hAnsi="Arial" w:cs="Arial" w:hint="eastAsia"/>
+          <w:b/>
+        </w:rPr>
+        <w:t>mausoleum</w:t>
+      </w:r>
+      <w:r>
+        <w:rPr>
+          <w:rStyle w:val="pron"/>
+          <w:rFonts w:ascii="Arial" w:hAnsi="Arial" w:cs="Arial" w:hint="eastAsia"/>
+        </w:rPr>
+        <w:t xml:space="preserve"> /</w:t>
+      </w:r>
+      <w:r>
+        <w:rPr>
+          <w:rStyle w:val="pron"/>
+          <w:rFonts w:ascii="GWIPA" w:hAnsi="GWIPA" w:cs="Arial"/>
+        </w:rPr>
+        <w:t></w:t>
+      </w:r>
+      <w:r>
+        <w:rPr>
+          <w:rStyle w:val="pron"/>
+          <w:rFonts w:ascii="GWIPA" w:hAnsi="GWIPA" w:cs="Arial"/>
+        </w:rPr>
+        <w:t></w:t>
+      </w:r>
+      <w:r>
+        <w:rPr>
+          <w:rStyle w:val="pron"/>
+          <w:rFonts w:ascii="GWIPA" w:hAnsi="GWIPA" w:cs="Arial"/>
+        </w:rPr>
+        <w:t></w:t>
+      </w:r>
+      <w:r>
+        <w:rPr>
+          <w:rStyle w:val="pron"/>
+          <w:rFonts w:ascii="GWIPA" w:hAnsi="GWIPA" w:cs="Arial"/>
+        </w:rPr>
+        <w:t></w:t>
+      </w:r>
+      <w:r>
+        <w:rPr>
+          <w:rStyle w:val="pron"/>
+          <w:rFonts w:ascii="GWIPA" w:hAnsi="GWIPA" w:cs="Arial"/>
+        </w:rPr>
+        <w:t></w:t>
+      </w:r>
+      <w:r>
+        <w:rPr>
+          <w:rStyle w:val="pron"/>
+          <w:rFonts w:ascii="GWIPA" w:hAnsi="GWIPA" w:cs="Arial"/>
+        </w:rPr>
+        <w:t></w:t>
+      </w:r>
+      <w:r>
+        <w:rPr>
+          <w:rStyle w:val="pron"/>
+          <w:rFonts w:ascii="GWIPA" w:hAnsi="GWIPA" w:cs="Arial"/>
+        </w:rPr>
+        <w:t></w:t>
+      </w:r>
+      <w:r>
+        <w:rPr>
+          <w:rStyle w:val="pron"/>
+          <w:rFonts w:ascii="GWIPA" w:hAnsi="GWIPA" w:cs="Arial"/>
+        </w:rPr>
+        <w:t></w:t>
+      </w:r>
+      <w:r>
+        <w:rPr>
+          <w:rStyle w:val="pron"/>
+          <w:rFonts w:ascii="GWIPA" w:hAnsi="GWIPA" w:cs="Arial"/>
+        </w:rPr>
+        <w:t></w:t>
+      </w:r>
+      <w:r>
+        <w:rPr>
+          <w:rStyle w:val="pron"/>
+          <w:rFonts w:ascii="GWIPA" w:hAnsi="GWIPA" w:cs="Arial"/>
+        </w:rPr>
+        <w:t></w:t>
+      </w:r>
+      <w:r>
+        <w:rPr>
+          <w:rStyle w:val="pron"/>
+          <w:rFonts w:ascii="GWIPA" w:hAnsi="GWIPA" w:cs="Arial"/>
+        </w:rPr>
+        <w:t></w:t>
+      </w:r>
+      <w:r>
+        <w:rPr>
+          <w:rStyle w:val="pron"/>
+          <w:rFonts w:ascii="Arial" w:hAnsi="Arial" w:cs="Arial" w:hint="eastAsia"/>
+        </w:rPr>
+        <w:t>/</w:t>
       </w:r>
       <w:bookmarkStart w:id="0" w:name="_GoBack"/>
       <w:bookmarkEnd w:id="0"/>
-    </w:p>
-    <w:p>
-      <w:pPr>
-        <w:rPr>
-          <w:rStyle w:val="pron"/>
-          <w:rFonts w:ascii="Times New Roman" w:hAnsi="Times New Roman" w:cs="Times New Roman"/>
-        </w:rPr>
-      </w:pPr>
-      <w:r>
-        <w:rPr>
-          <w:rStyle w:val="pron"/>
-          <w:rFonts w:ascii="Times New Roman" w:hAnsi="Times New Roman" w:cs="Times New Roman" w:hint="eastAsia"/>
-          <w:b/>
-        </w:rPr>
-        <w:t>deadstock</w:t>
-      </w:r>
-      <w:r>
-        <w:rPr>
-          <w:rStyle w:val="pron"/>
-          <w:rFonts w:ascii="Times New Roman" w:hAnsi="Times New Roman" w:cs="Times New Roman"/>
-        </w:rPr>
-        <w:br/>
-      </w:r>
-      <w:r>
-        <w:rPr>
-          <w:rStyle w:val="pron"/>
-          <w:rFonts w:ascii="Times New Roman" w:hAnsi="Times New Roman" w:cs="Times New Roman" w:hint="eastAsia"/>
-        </w:rPr>
-        <w:t>[n.] the machine us</w:t>
-      </w:r>
-      <w:r>
-        <w:rPr>
-          <w:rStyle w:val="pron"/>
-          <w:rFonts w:ascii="Times New Roman" w:hAnsi="Times New Roman" w:cs="Times New Roman" w:hint="eastAsia"/>
-        </w:rPr>
-        <w:t>ed on a farm as opposed to the live</w:t>
-      </w:r>
-      <w:r>
-        <w:rPr>
-          <w:rStyle w:val="pron"/>
-          <w:rFonts w:ascii="Times New Roman" w:hAnsi="Times New Roman" w:cs="Times New Roman" w:hint="eastAsia"/>
-        </w:rPr>
-        <w:t>stock</w:t>
-      </w:r>
-      <w:r>
-        <w:rPr>
-          <w:rStyle w:val="pron"/>
-          <w:rFonts w:ascii="Times New Roman" w:hAnsi="Times New Roman" w:cs="Times New Roman" w:hint="eastAsia"/>
-        </w:rPr>
-        <w:t>.</w:t>
-      </w:r>
-    </w:p>
-    <w:p>
-      <w:pPr>
-        <w:rPr>
-          <w:rFonts w:ascii="Times New Roman" w:hAnsi="Times New Roman" w:cs="Times New Roman"/>
-        </w:rPr>
-      </w:pPr>
+      <w:r>
+        <w:rPr>
+          <w:rStyle w:val="pron"/>
+          <w:rFonts w:ascii="Arial" w:hAnsi="Arial" w:cs="Arial"/>
+        </w:rPr>
+        <w:br/>
+      </w:r>
+      <w:r>
+        <w:rPr>
+          <w:rStyle w:val="pron"/>
+          <w:rFonts w:ascii="Arial" w:hAnsi="Arial" w:cs="Arial" w:hint="eastAsia"/>
+        </w:rPr>
+        <w:t>[n.] a special building made to hold the dead body of an important person or the dead</w:t>
+      </w:r>
     </w:p>
     <w:sectPr>
       <w:pgSz w:w="12240" w:h="15840"/>

</xml_diff>